<commit_message>
Round-6 Seat 1 fixes: Shleifer attribution, manuscript matches letter claims, section mapping, whole-entry blue references
Co-Authored-By: Claude Opus 5.5 <noreply@anthropic.com>
Claude-Session: https://claude.ai/code/session_01Ny4MKFPCnQG8RbtvfHQ86Z
</commit_message>
<xml_diff>
--- a/SAJE_292892_revision/build_r6/02_Manuscript_Revised_Marked_blue.docx
+++ b/SAJE_292892_revision/build_r6/02_Manuscript_Revised_Marked_blue.docx
@@ -563,7 +563,7 @@
         <w:rPr>
           <w:color w:val="0000FF"/>
         </w:rPr>
-        <w:t>The high realized returns of green assets reflect unexpected increases in ESG concerns rather than high expected returns (Pástor et al., 2022), and part of the price increase at S&amp;P 500 inclusion reverses within weeks (Harris &amp; Gurel, 1986; Shleifer, 1986).</w:t>
+        <w:t>The high realized returns of green assets reflect unexpected increases in ESG concerns rather than high expected returns (Pástor et al., 2022), S&amp;P 500 inclusion raises prices (Harris &amp; Gurel, 1986; Shleifer, 1986), and part of the increase reverses within weeks (Harris &amp; Gurel, 1986).</w:t>
       </w:r>
       <w:r>
         <w:rPr/>
@@ -3511,6 +3511,16 @@
         <w:rPr>
           <w:color w:val="0000FF"/>
         </w:rPr>
+        <w:t>Because scored firms are concentrated in the base years 2019 to 2022, these level differences mix calendar effects with selection.</w:t>
+      </w:r>
+      <w:r>
+        <w:rPr/>
+        <w:t xml:space="preserve"> </w:t>
+      </w:r>
+      <w:r>
+        <w:rPr>
+          <w:color w:val="0000FF"/>
+        </w:rPr>
         <w:t>In Malaysia, where the expansion was broadest, the median total assets of scored firms, each firm measured by its median over all sample years, were 3.3 times those of the 565 never-scored firms.</w:t>
       </w:r>
     </w:p>
@@ -4887,7 +4897,7 @@
         <w:rPr>
           <w:color w:val="0000FF"/>
         </w:rPr>
-        <w:t>Table 2 reports the headline estimates.</w:t>
+        <w:t>Table 2 reports the headline estimates under parallel trends.</w:t>
       </w:r>
       <w:r>
         <w:rPr/>
@@ -10177,7 +10187,7 @@
         <w:rPr>
           <w:color w:val="0000FF"/>
         </w:rPr>
-        <w:t>Two readings fit this pattern.</w:t>
+        <w:t>Two readings fit this pattern, and the data cannot separate them.</w:t>
       </w:r>
       <w:r>
         <w:rPr/>
@@ -11926,7 +11936,7 @@
         <w:rPr>
           <w:color w:val="0000FF"/>
         </w:rPr>
-        <w:t>The restricted estimate thus describes mid-sized scored firms, largely from the Malaysian expansion.</w:t>
+        <w:t>The restricted estimate thus describes mid-sized scored firms, largely from the Malaysian expansion, and says little about the largest firms.</w:t>
       </w:r>
     </w:p>
     <w:p>
@@ -14447,7 +14457,7 @@
         <w:rPr>
           <w:color w:val="0000FF"/>
         </w:rPr>
-        <w:t>Under the parallel trends assumption, the largest increase compatible with the headline interval is of the same order as the announcement return of 4.86% that Demiroglu and Ryngaert (2010) report for the first analyst coverage of neglected stocks, and because annual ratios miss short-lived price pressure, such as the partly reversed price rise at S&amp;P 500 inclusion (Harris &amp; Gurel, 1986; Shleifer, 1986), our estimates concern lasting revaluation (Chen et al., 2004).</w:t>
+        <w:t>Under the parallel trends assumption, the largest increase compatible with the headline interval is of the same order as the announcement return of 4.86% that Demiroglu and Ryngaert (2010) report for the first analyst coverage of neglected stocks, and because annual ratios miss short-lived price pressure, such as the price rise at S&amp;P 500 inclusion (Shleifer, 1986), part of which reverses within weeks (Harris &amp; Gurel, 1986), our estimates concern lasting revaluation (Chen et al., 2004).</w:t>
       </w:r>
       <w:r>
         <w:rPr/>
@@ -14613,7 +14623,7 @@
         <w:rPr>
           <w:color w:val="0000FF"/>
         </w:rPr>
-        <w:t>For researchers, comparisons of scored and unscored firms, static TWFE estimates, and backtests built on the first recorded score can attribute selection to the score (Berg et al., 2020; Sahin et al., 2023), so studies of ESG ratings in Southeast Asia should model when firms enter coverage and record the download date of their rating data.</w:t>
+        <w:t>For researchers, comparisons of scored and unscored firms, static TWFE estimates, and backtests built on the first recorded score can attribute selection to the score (Berg et al., 2020; Sahin et al., 2023), so studies of ESG ratings in Southeast Asia should model when firms enter coverage, report pre-entry dynamics, and record the download date of their rating data.</w:t>
       </w:r>
       <w:r>
         <w:rPr/>
@@ -14643,7 +14653,7 @@
         <w:rPr>
           <w:color w:val="0000FF"/>
         </w:rPr>
-        <w:t>For exchanges and regulators, broad expansions such as the Malaysian wave appear to select less on prior growth, and we detect no MTB gain within them, although the interval (−0.053 to 0.091) admits gains larger than the pooled upper bound; arguments for expanding coverage should therefore rest on grounds other than an expected rise in issuer valuations.</w:t>
+        <w:t>For exchanges, regulators, and listed firms, broad expansions such as the Malaysian wave appear to select less on prior growth, and we detect no MTB gain within them, although the interval (−0.053 to 0.091) admits gains larger than the pooled upper bound; arguments for expanding coverage should therefore rest on grounds other than an expected rise in issuer valuations.</w:t>
       </w:r>
     </w:p>
     <w:p>
@@ -14676,7 +14686,7 @@
         <w:rPr>
           <w:color w:val="0000FF"/>
         </w:rPr>
-        <w:t>We observe neither publication dates, returns, ownership, nor index membership, and only LSEG coverage.</w:t>
+        <w:t>We observe neither publication dates, returns, ownership, nor index membership, and only LSEG coverage, and flagging implausible market capitalization removes order-of-magnitude recording errors but not smaller ones.</w:t>
       </w:r>
       <w:r>
         <w:rPr/>
@@ -15048,57 +15058,7 @@
         <w:rPr>
           <w:color w:val="0000FF"/>
         </w:rPr>
-        <w:t>Crump, R.</w:t>
-      </w:r>
-      <w:r>
-        <w:rPr/>
-        <w:t xml:space="preserve"> </w:t>
-      </w:r>
-      <w:r>
-        <w:rPr>
-          <w:color w:val="0000FF"/>
-        </w:rPr>
-        <w:t>K., Hotz, V.</w:t>
-      </w:r>
-      <w:r>
-        <w:rPr/>
-        <w:t xml:space="preserve"> </w:t>
-      </w:r>
-      <w:r>
-        <w:rPr>
-          <w:color w:val="0000FF"/>
-        </w:rPr>
-        <w:t>J., Imbens, G.</w:t>
-      </w:r>
-      <w:r>
-        <w:rPr/>
-        <w:t xml:space="preserve"> </w:t>
-      </w:r>
-      <w:r>
-        <w:rPr>
-          <w:color w:val="0000FF"/>
-        </w:rPr>
-        <w:t>W., &amp; Mitnik, O.</w:t>
-      </w:r>
-      <w:r>
-        <w:rPr/>
-        <w:t xml:space="preserve"> A. </w:t>
-      </w:r>
-      <w:r>
-        <w:rPr>
-          <w:color w:val="0000FF"/>
-        </w:rPr>
-        <w:t>(2009).</w:t>
-      </w:r>
-      <w:r>
-        <w:rPr/>
-        <w:t xml:space="preserve"> </w:t>
-      </w:r>
-      <w:r>
-        <w:rPr>
-          <w:color w:val="0000FF"/>
-        </w:rPr>
-        <w:t xml:space="preserve">Dealing with limited overlap in estimation of average treatment effects. </w:t>
+        <w:t xml:space="preserve">Crump, R. K., Hotz, V. J., Imbens, G. W., &amp; Mitnik, O. A. (2009). Dealing with limited overlap in estimation of average treatment effects. </w:t>
       </w:r>
       <w:r>
         <w:rPr>
@@ -15463,14 +15423,10 @@
         <w:ind w:left="720" w:hanging="720"/>
       </w:pPr>
       <w:r>
-        <w:rPr/>
-        <w:t xml:space="preserve">LSEG. </w:t>
-      </w:r>
-      <w:r>
         <w:rPr>
           <w:color w:val="0000FF"/>
         </w:rPr>
-        <w:t xml:space="preserve">(2023). </w:t>
+        <w:t xml:space="preserve">LSEG. (2023). </w:t>
       </w:r>
       <w:r>
         <w:rPr>
@@ -15545,27 +15501,7 @@
         <w:rPr>
           <w:color w:val="0000FF"/>
         </w:rPr>
-        <w:t>Nguyen, T.</w:t>
-      </w:r>
-      <w:r>
-        <w:rPr/>
-        <w:t xml:space="preserve"> </w:t>
-      </w:r>
-      <w:r>
-        <w:rPr>
-          <w:color w:val="0000FF"/>
-        </w:rPr>
-        <w:t>T.</w:t>
-      </w:r>
-      <w:r>
-        <w:rPr/>
-        <w:t xml:space="preserve"> (2025). </w:t>
-      </w:r>
-      <w:r>
-        <w:rPr>
-          <w:color w:val="0000FF"/>
-        </w:rPr>
-        <w:t xml:space="preserve">Ownership structure and corporate social responsibility: Evidence from Vietnam. </w:t>
+        <w:t xml:space="preserve">Nguyen, T. T. (2025). Ownership structure and corporate social responsibility: Evidence from Vietnam. </w:t>
       </w:r>
       <w:r>
         <w:rPr>
@@ -15600,14 +15536,10 @@
         <w:ind w:left="720" w:hanging="720"/>
       </w:pPr>
       <w:r>
-        <w:rPr/>
-        <w:t xml:space="preserve">Otoritas Jasa Keuangan. </w:t>
-      </w:r>
-      <w:r>
         <w:rPr>
           <w:color w:val="0000FF"/>
         </w:rPr>
-        <w:t xml:space="preserve">(2017). </w:t>
+        <w:t xml:space="preserve">Otoritas Jasa Keuangan. (2017). </w:t>
       </w:r>
       <w:r>
         <w:rPr>
@@ -15722,17 +15654,7 @@
         <w:rPr>
           <w:color w:val="0000FF"/>
         </w:rPr>
-        <w:t>Prukumpai, S., Sethapramote, Y., &amp; Luangaram, P.</w:t>
-      </w:r>
-      <w:r>
-        <w:rPr/>
-        <w:t xml:space="preserve"> (2022). </w:t>
-      </w:r>
-      <w:r>
-        <w:rPr>
-          <w:color w:val="0000FF"/>
-        </w:rPr>
-        <w:t xml:space="preserve">Political uncertainty and the Thai stock market. </w:t>
+        <w:t xml:space="preserve">Prukumpai, S., Sethapramote, Y., &amp; Luangaram, P. (2022). Political uncertainty and the Thai stock market. </w:t>
       </w:r>
       <w:r>
         <w:rPr>
@@ -16010,17 +15932,7 @@
         <w:rPr>
           <w:color w:val="0000FF"/>
         </w:rPr>
-        <w:t>Sudsawasd, S., &amp; Sakdapat, P.</w:t>
-      </w:r>
-      <w:r>
-        <w:rPr/>
-        <w:t xml:space="preserve"> (2026). </w:t>
-      </w:r>
-      <w:r>
-        <w:rPr>
-          <w:color w:val="0000FF"/>
-        </w:rPr>
-        <w:t xml:space="preserve">Transaction costs and stock market behavior: Evidence from Thailand. </w:t>
+        <w:t xml:space="preserve">Sudsawasd, S., &amp; Sakdapat, P. (2026). Transaction costs and stock market behavior: Evidence from Thailand. </w:t>
       </w:r>
       <w:r>
         <w:rPr>

</xml_diff>

<commit_message>
Final round: Introduction roadmap, round-6 Seat 2 minor fixes, final package
Co-Authored-By: Claude Opus 5.5 <noreply@anthropic.com>
Claude-Session: https://claude.ai/code/session_01Ny4MKFPCnQG8RbtvfHQ86Z
</commit_message>
<xml_diff>
--- a/SAJE_292892_revision/build_r6/02_Manuscript_Revised_Marked_blue.docx
+++ b/SAJE_292892_revision/build_r6/02_Manuscript_Revised_Marked_blue.docx
@@ -415,6 +415,59 @@
     </w:p>
     <w:p>
       <w:pPr>
+        <w:spacing w:line="360" w:lineRule="auto" w:after="120" w:before="0"/>
+        <w:ind w:firstLine="720"/>
+        <w:jc w:val="both"/>
+      </w:pPr>
+      <w:r>
+        <w:rPr>
+          <w:color w:val="0000FF"/>
+        </w:rPr>
+        <w:t>The remainder of the paper is organized as follows.</w:t>
+      </w:r>
+      <w:r>
+        <w:rPr/>
+        <w:t xml:space="preserve"> </w:t>
+      </w:r>
+      <w:r>
+        <w:rPr>
+          <w:color w:val="0000FF"/>
+        </w:rPr>
+        <w:t>Section 2 reviews the literature on ESG ratings, investor recognition and preferences, and provider coverage, and states the hypotheses.</w:t>
+      </w:r>
+      <w:r>
+        <w:rPr/>
+        <w:t xml:space="preserve"> </w:t>
+      </w:r>
+      <w:r>
+        <w:rPr>
+          <w:color w:val="0000FF"/>
+        </w:rPr>
+        <w:t>Section 3 describes the institutional setting, the data, the dating of the first recorded score, and the estimation and inference methods.</w:t>
+      </w:r>
+      <w:r>
+        <w:rPr/>
+        <w:t xml:space="preserve"> </w:t>
+      </w:r>
+      <w:r>
+        <w:rPr>
+          <w:color w:val="0000FF"/>
+        </w:rPr>
+        <w:t>Section 4 reports who gets scored, the valuation path around entry, the comparison of the two datings, and the sensitivity and robustness checks.</w:t>
+      </w:r>
+      <w:r>
+        <w:rPr/>
+        <w:t xml:space="preserve"> </w:t>
+      </w:r>
+      <w:r>
+        <w:rPr>
+          <w:color w:val="0000FF"/>
+        </w:rPr>
+        <w:t>Section 5 discusses the findings, their mechanisms and implications, and the limitations, and concludes.</w:t>
+      </w:r>
+    </w:p>
+    <w:p>
+      <w:pPr>
         <w:pStyle w:val="Heading1"/>
         <w:keepNext/>
         <w:spacing w:line="360" w:lineRule="auto" w:after="120" w:before="360"/>
@@ -821,7 +874,7 @@
         <w:rPr>
           <w:color w:val="0000FF"/>
         </w:rPr>
-        <w:t>The data combine the annual LSEG ESG score (LSEG, 2025), not the controversy-adjusted combined score, with accounting and market data from Compustat Global (S&amp;P Global Market Intelligence, 2025) for 3,709 listed firms, each with a row for every year from 2014 to 2024; rows before a firm lists carry no data.</w:t>
+        <w:t>The data combine the annual LSEG ESG score (LSEG, 2025), not the controversy-adjusted combined score, with accounting and market data from Compustat Global (S&amp;P Global Market Intelligence, 2025) for 3,709 listed firms, each with a row for every year from 2014 to 2024; rows for years without listing data are empty, almost all of them before a firm lists.</w:t>
       </w:r>
       <w:r>
         <w:rPr/>
@@ -4917,7 +4970,7 @@
         <w:rPr>
           <w:color w:val="0000FF"/>
         </w:rPr>
-        <w:t>With the cluster bootstrap, which allows for market-wide shocks such as the political uncertainty that moves Thai stock prices (Prukumpai et al., 2022), the interval is −0.050 to 0.053.</w:t>
+        <w:t>With the cluster bootstrap, which resamples the 50 market-by-industry clusters and so allows for shocks common to firms of the same market and industry (Table S4), the interval is −0.050 to 0.053; market-wide shocks, such as the political uncertainty that moves Thai stock prices (Prukumpai et al., 2022), are absorbed by the country indicators in the long-difference regression.</w:t>
       </w:r>
       <w:r>
         <w:rPr/>
@@ -10101,7 +10154,7 @@
         <w:rPr>
           <w:color w:val="0000FF"/>
         </w:rPr>
-        <w:t>The row 4 step, −0.044, is therefore minus each cohort's own change between g − 1 and g (0.044 on average) weighted as in event years 1 to 4, which fall most on the early cohorts observed longest after entry; it is an accounting identity, not a separate estimate, and it is larger than the pooled event-year-0 estimate in Figure 1.</w:t>
+        <w:t>The row 4 step, −0.044, is therefore minus each cohort's own change between g − 1 and g (0.044 on average) weighted as in event years 1 to 4, which give more weight than event year 0 to the early cohorts observed longest after entry; it is an accounting identity, not a separate estimate, and it is larger than the pooled event-year-0 estimate in Figure 1.</w:t>
       </w:r>
       <w:r>
         <w:rPr/>
@@ -14354,7 +14407,7 @@
         <w:rPr>
           <w:color w:val="0000FF"/>
         </w:rPr>
-        <w:t>The static TWFE regression attributes an increase of 0.064 in log MTB (p = 0.014) to coverage; comparing each cohort with its own base year accounts for about half of the gap to the headline estimate, and conditioning on base-year size for most of the rest (Table S5).</w:t>
+        <w:t>The static TWFE regression attributes an increase of 0.064 in log MTB (p = 0.014) to coverage; comparing each cohort with its own base year accounts for about half of the gap to the headline estimate, and conditioning on the base-year covariates (country, industry, and size) for most of the rest (Table S5).</w:t>
       </w:r>
     </w:p>
     <w:p>
@@ -14527,7 +14580,7 @@
         <w:rPr>
           <w:color w:val="0000FF"/>
         </w:rPr>
-        <w:t>This ordering does not rest on parallel trends or on the dating of publication, although its size depends on conditioning on base-year size: without covariates, the MTB run-up is 6.6% (pre-trend p = 0.028).</w:t>
+        <w:t>This ordering does not rest on parallel trends or on the dating of publication, although its size depends on conditioning on the base-year covariates: without covariates, the MTB run-up is 6.6% (pre-trend p = 0.028).</w:t>
       </w:r>
       <w:r>
         <w:rPr/>

</xml_diff>